<commit_message>
the ALQ title page was missing the abstract and the keywords it is required to carry
The journal's instructions say the separate title page carries the title,
the authors' details, the abstract, keywords and acknowledgements; the Attach
Files step then reads that document to pre-fill the submission form. Ours,
written for a different journal, had everything but the abstract and the
keywords -- so the form would have been filled from a file missing exactly
the two fields it was there to supply.

Both are now lifted from main.tex at build time rather than retyped, and the
title page inputs numbers.tex, because the abstract quotes six generated
figures and a second hand-typed copy of them is the drift this repository
exists to prevent.
</commit_message>
<xml_diff>
--- a/docs/research/definitions_paper/submission_title_page.docx
+++ b/docs/research/definitions_paper/submission_title_page.docx
@@ -53,12 +53,166 @@
         <w:t xml:space="preserve">ORCID: 0009-0001-0832-0995</w:t>
       </w:r>
     </w:p>
-    <w:bookmarkStart w:id="20" w:name="word-count"/>
+    <w:bookmarkStart w:id="20" w:name="abstract"/>
     <w:p>
       <w:pPr>
         <w:pStyle w:val="Heading2"/>
       </w:pPr>
       <w:r>
+        <w:t xml:space="preserve">Abstract</w:t>
+      </w:r>
+    </w:p>
+    <w:p>
+      <w:pPr>
+        <w:pStyle w:val="FirstParagraph"/>
+      </w:pPr>
+      <w:r>
+        <w:t xml:space="preserve">Drafting manuals agree that a term should carry a stable meaning across a</w:t>
+      </w:r>
+      <w:r>
+        <w:t xml:space="preserve"> </w:t>
+      </w:r>
+      <w:r>
+        <w:t xml:space="preserve">legal system. Whether real systems comply has never been measured, because</w:t>
+      </w:r>
+      <w:r>
+        <w:t xml:space="preserve"> </w:t>
+      </w:r>
+      <w:r>
+        <w:t xml:space="preserve">settling it requires every statutory definition in a jurisdiction, extracted</w:t>
+      </w:r>
+      <w:r>
+        <w:t xml:space="preserve"> </w:t>
+      </w:r>
+      <w:r>
+        <w:t xml:space="preserve">from the instrument that made it. This article supplies that measurement for</w:t>
+      </w:r>
+      <w:r>
+        <w:t xml:space="preserve"> </w:t>
+      </w:r>
+      <w:r>
+        <w:t xml:space="preserve">Saudi Arabia — 290 instruments, 1</w:t>
+      </w:r>
+      <w:r>
+        <w:t xml:space="preserve">,</w:t>
+      </w:r>
+      <w:r>
+        <w:t xml:space="preserve">920 defined terms,</w:t>
+      </w:r>
+      <w:r>
+        <w:t xml:space="preserve"> </w:t>
+      </w:r>
+      <w:r>
+        <w:t xml:space="preserve">3</w:t>
+      </w:r>
+      <w:r>
+        <w:t xml:space="preserve">,</w:t>
+      </w:r>
+      <w:r>
+        <w:t xml:space="preserve">318 definitions — and argues that the measurement is worth less</w:t>
+      </w:r>
+      <w:r>
+        <w:t xml:space="preserve"> </w:t>
+      </w:r>
+      <w:r>
+        <w:t xml:space="preserve">than the two distinctions needed to perform it. The first separates</w:t>
+      </w:r>
+      <w:r>
+        <w:t xml:space="preserve"> </w:t>
+      </w:r>
+      <w:r>
+        <w:rPr>
+          <w:iCs/>
+          <w:i/>
+        </w:rPr>
+        <w:t xml:space="preserve">indexical</w:t>
+      </w:r>
+      <w:r>
+        <w:t xml:space="preserve"> </w:t>
+      </w:r>
+      <w:r>
+        <w:t xml:space="preserve">definitions, where an instrument defines</w:t>
+      </w:r>
+      <w:r>
+        <w:t xml:space="preserve"> </w:t>
+      </w:r>
+      <w:r>
+        <w:t xml:space="preserve">‘</w:t>
+      </w:r>
+      <w:r>
+        <w:t xml:space="preserve">the Law</w:t>
+      </w:r>
+      <w:r>
+        <w:t xml:space="preserve">’</w:t>
+      </w:r>
+      <w:r>
+        <w:t xml:space="preserve"> </w:t>
+      </w:r>
+      <w:r>
+        <w:t xml:space="preserve">as itself,</w:t>
+      </w:r>
+      <w:r>
+        <w:t xml:space="preserve"> </w:t>
+      </w:r>
+      <w:r>
+        <w:t xml:space="preserve">from substantive ones; indexical definitions are the most repeated and cannot</w:t>
+      </w:r>
+      <w:r>
+        <w:t xml:space="preserve"> </w:t>
+      </w:r>
+      <w:r>
+        <w:t xml:space="preserve">disagree. The second separates lexical from substantive divergence:</w:t>
+      </w:r>
+      <w:r>
+        <w:t xml:space="preserve"> </w:t>
+      </w:r>
+      <w:r>
+        <w:t xml:space="preserve">61.5 per cent of shared substantive terms are worded</w:t>
+      </w:r>
+      <w:r>
+        <w:t xml:space="preserve"> </w:t>
+      </w:r>
+      <w:r>
+        <w:t xml:space="preserve">differently, and most of that is paraphrase. Reading the 12 most</w:t>
+      </w:r>
+      <w:r>
+        <w:t xml:space="preserve"> </w:t>
+      </w:r>
+      <w:r>
+        <w:t xml:space="preserve">widely shared terms yields 4 genuine conflicts. Fragmentation is</w:t>
+      </w:r>
+      <w:r>
+        <w:t xml:space="preserve"> </w:t>
+      </w:r>
+      <w:r>
+        <w:t xml:space="preserve">real but narrow, and therefore a tractable target for drafting reform.</w:t>
+      </w:r>
+    </w:p>
+    <w:bookmarkEnd w:id="20"/>
+    <w:bookmarkStart w:id="21" w:name="keywords"/>
+    <w:p>
+      <w:pPr>
+        <w:pStyle w:val="Heading2"/>
+      </w:pPr>
+      <w:r>
+        <w:t xml:space="preserve">Keywords</w:t>
+      </w:r>
+    </w:p>
+    <w:p>
+      <w:pPr>
+        <w:pStyle w:val="FirstParagraph"/>
+      </w:pPr>
+      <w:r>
+        <w:t xml:space="preserve">statutory definitions; legislative drafting; interpretation; Saudi Arabia; legal corpora; terminological consistency</w:t>
+      </w:r>
+    </w:p>
+    <w:bookmarkEnd w:id="21"/>
+    <w:bookmarkStart w:id="22" w:name="word-count"/>
+    <w:p>
+      <w:pPr>
+        <w:pStyle w:val="Heading2"/>
+      </w:pPr>
+      <w:r>
         <w:t xml:space="preserve">Word count</w:t>
       </w:r>
     </w:p>
@@ -70,8 +224,8 @@
         <w:t xml:space="preserve">8,002 words, including footnotes.</w:t>
       </w:r>
     </w:p>
-    <w:bookmarkEnd w:id="20"/>
-    <w:bookmarkStart w:id="21" w:name="funding"/>
+    <w:bookmarkEnd w:id="22"/>
+    <w:bookmarkStart w:id="23" w:name="funding"/>
     <w:p>
       <w:pPr>
         <w:pStyle w:val="Heading2"/>
@@ -88,8 +242,8 @@
         <w:t xml:space="preserve">No funding was received for conducting this study.</w:t>
       </w:r>
     </w:p>
-    <w:bookmarkEnd w:id="21"/>
-    <w:bookmarkStart w:id="22" w:name="conflict-of-interest"/>
+    <w:bookmarkEnd w:id="23"/>
+    <w:bookmarkStart w:id="24" w:name="conflict-of-interest"/>
     <w:p>
       <w:pPr>
         <w:pStyle w:val="Heading2"/>
@@ -106,8 +260,8 @@
         <w:t xml:space="preserve">The author declares no conflict of interest.</w:t>
       </w:r>
     </w:p>
-    <w:bookmarkEnd w:id="22"/>
-    <w:bookmarkStart w:id="23" w:name="ethics-approval"/>
+    <w:bookmarkEnd w:id="24"/>
+    <w:bookmarkStart w:id="25" w:name="ethics-approval"/>
     <w:p>
       <w:pPr>
         <w:pStyle w:val="Heading2"/>
@@ -130,8 +284,8 @@
         <w:t xml:space="preserve">and no personal data. It analyses published national legislation only.</w:t>
       </w:r>
     </w:p>
-    <w:bookmarkEnd w:id="23"/>
-    <w:bookmarkStart w:id="24" w:name="acknowledgements"/>
+    <w:bookmarkEnd w:id="25"/>
+    <w:bookmarkStart w:id="26" w:name="acknowledgements"/>
     <w:p>
       <w:pPr>
         <w:pStyle w:val="Heading2"/>
@@ -148,8 +302,8 @@
         <w:t xml:space="preserve">None.</w:t>
       </w:r>
     </w:p>
-    <w:bookmarkEnd w:id="24"/>
-    <w:bookmarkStart w:id="28" w:name="data-availability"/>
+    <w:bookmarkEnd w:id="26"/>
+    <w:bookmarkStart w:id="30" w:name="data-availability"/>
     <w:p>
       <w:pPr>
         <w:pStyle w:val="Heading2"/>
@@ -180,7 +334,7 @@
       <w:r>
         <w:t xml:space="preserve"> </w:t>
       </w:r>
-      <w:hyperlink r:id="rId25">
+      <w:hyperlink r:id="rId27">
         <w:r>
           <w:rPr>
             <w:rStyle w:val="Hyperlink"/>
@@ -206,7 +360,7 @@
       <w:r>
         <w:t xml:space="preserve">(</w:t>
       </w:r>
-      <w:hyperlink r:id="rId26">
+      <w:hyperlink r:id="rId28">
         <w:r>
           <w:rPr>
             <w:rStyle w:val="Hyperlink"/>
@@ -226,7 +380,7 @@
       <w:r>
         <w:t xml:space="preserve"> </w:t>
       </w:r>
-      <w:hyperlink r:id="rId27">
+      <w:hyperlink r:id="rId29">
         <w:r>
           <w:rPr>
             <w:rStyle w:val="Hyperlink"/>
@@ -238,8 +392,8 @@
         <w:t xml:space="preserve">).</w:t>
       </w:r>
     </w:p>
-    <w:bookmarkEnd w:id="28"/>
-    <w:bookmarkStart w:id="29" w:name="related-work-by-the-author"/>
+    <w:bookmarkEnd w:id="30"/>
+    <w:bookmarkStart w:id="31" w:name="related-work-by-the-author"/>
     <w:p>
       <w:pPr>
         <w:pStyle w:val="Heading2"/>
@@ -274,8 +428,8 @@
         <w:t xml:space="preserve">and neither is under consideration by this journal.</w:t>
       </w:r>
     </w:p>
-    <w:bookmarkEnd w:id="29"/>
-    <w:bookmarkStart w:id="30" w:name="legal-status-of-the-sources"/>
+    <w:bookmarkEnd w:id="31"/>
+    <w:bookmarkStart w:id="32" w:name="legal-status-of-the-sources"/>
     <w:p>
       <w:pPr>
         <w:pStyle w:val="Heading2"/>
@@ -323,7 +477,7 @@
         <w:t xml:space="preserve">given as recorded in the corpus registry.</w:t>
       </w:r>
     </w:p>
-    <w:bookmarkEnd w:id="30"/>
+    <w:bookmarkEnd w:id="32"/>
     <w:sectPr/>
   </w:body>
 </w:document>

</xml_diff>